<commit_message>
docs: complete AV1 evidence and ABET records
</commit_message>
<xml_diff>
--- a/output/docx/upc-pre-202610-1asi0732-9100-teralume-performance-av1.docx
+++ b/output/docx/upc-pre-202610-1asi0732-9100-teralume-performance-av1.docx
@@ -2,136 +2,57 @@
 <file path=word/document.xml><?xml version="1.0" encoding="utf-8"?>
 <w:document xmlns:wpc="http://schemas.microsoft.com/office/word/2010/wordprocessingCanvas" xmlns:mo="http://schemas.microsoft.com/office/mac/office/2008/main" xmlns:mc="http://schemas.openxmlformats.org/markup-compatibility/2006" xmlns:mv="urn:schemas-microsoft-com:mac:vml" xmlns:o="urn:schemas-microsoft-com:office:office" xmlns:r="http://schemas.openxmlformats.org/officeDocument/2006/relationships" xmlns:m="http://schemas.openxmlformats.org/officeDocument/2006/math" xmlns:v="urn:schemas-microsoft-com:vml" xmlns:wp14="http://schemas.microsoft.com/office/word/2010/wordprocessingDrawing" xmlns:wp="http://schemas.openxmlformats.org/drawingml/2006/wordprocessingDrawing" xmlns:w10="urn:schemas-microsoft-com:office:word" xmlns:w="http://schemas.openxmlformats.org/wordprocessingml/2006/main" xmlns:w14="http://schemas.microsoft.com/office/word/2010/wordml" xmlns:wpg="http://schemas.microsoft.com/office/word/2010/wordprocessingGroup" xmlns:wpi="http://schemas.microsoft.com/office/word/2010/wordprocessingInk" xmlns:wne="http://schemas.microsoft.com/office/word/2006/wordml" xmlns:wps="http://schemas.microsoft.com/office/word/2010/wordprocessingShape" mc:Ignorable="w14 wp14">
   <w:body>
-    <w:p>
-      <w:pPr>
-        <w:jc w:val="center"/>
-      </w:pPr>
-      <w:r>
-        <w:drawing>
-          <wp:inline xmlns:a="http://schemas.openxmlformats.org/drawingml/2006/main" xmlns:pic="http://schemas.openxmlformats.org/drawingml/2006/picture">
-            <wp:extent cx="1874519" cy="1874519"/>
-            <wp:docPr id="1" name="Picture 1"/>
-            <wp:cNvGraphicFramePr>
-              <a:graphicFrameLocks noChangeAspect="1"/>
-            </wp:cNvGraphicFramePr>
-            <a:graphic>
-              <a:graphicData uri="http://schemas.openxmlformats.org/drawingml/2006/picture">
-                <pic:pic>
-                  <pic:nvPicPr>
-                    <pic:cNvPr id="0" name="upc-logo.png"/>
-                    <pic:cNvPicPr/>
-                  </pic:nvPicPr>
-                  <pic:blipFill>
-                    <a:blip r:embed="rId11"/>
-                    <a:stretch>
-                      <a:fillRect/>
-                    </a:stretch>
-                  </pic:blipFill>
-                  <pic:spPr>
-                    <a:xfrm>
-                      <a:off x="0" y="0"/>
-                      <a:ext cx="1874519" cy="1874519"/>
-                    </a:xfrm>
-                    <a:prstGeom prst="rect"/>
-                  </pic:spPr>
-                </pic:pic>
-              </a:graphicData>
-            </a:graphic>
-          </wp:inline>
-        </w:drawing>
-      </w:r>
-    </w:p>
-    <w:p/>
-    <w:p>
-      <w:pPr>
-        <w:jc w:val="center"/>
-      </w:pPr>
-      <w:r>
-        <w:rPr>
-          <w:b/>
-          <w:color w:val="16884A"/>
-          <w:sz w:val="20"/>
-        </w:rPr>
-        <w:t>DISEÑO DE EXPERIMENTOS DE INGENIERÍA DE SOFTWARE</w:t>
-      </w:r>
-    </w:p>
-    <w:p>
-      <w:pPr>
-        <w:pStyle w:val="Title"/>
-        <w:jc w:val="center"/>
-      </w:pPr>
-      <w:r>
-        <w:t>Participant Performance Report</w:t>
-      </w:r>
-    </w:p>
-    <w:p>
-      <w:pPr>
-        <w:jc w:val="center"/>
-      </w:pPr>
-      <w:r>
-        <w:rPr>
-          <w:color w:val="5F6B63"/>
-          <w:sz w:val="30"/>
-        </w:rPr>
-        <w:t>Reporte individual de desempeño — Hito AV1</w:t>
-      </w:r>
-    </w:p>
-    <w:p/>
     <w:tbl>
       <w:tblPr>
         <w:tblW w:type="auto" w:w="0"/>
         <w:jc w:val="center"/>
         <w:tblLayout w:type="fixed"/>
         <w:tblLook w:firstColumn="1" w:firstRow="1" w:lastColumn="0" w:lastRow="0" w:noHBand="0" w:noVBand="1" w:val="04A0"/>
+        <w:tblBorders>
+          <w:top w:val="single" w:sz="4" w:color="666666"/>
+          <w:left w:val="single" w:sz="4" w:color="666666"/>
+          <w:bottom w:val="single" w:sz="4" w:color="666666"/>
+          <w:right w:val="single" w:sz="4" w:color="666666"/>
+          <w:insideH w:val="single" w:sz="4" w:color="666666"/>
+          <w:insideV w:val="single" w:sz="4" w:color="666666"/>
+        </w:tblBorders>
       </w:tblPr>
       <w:tblGrid>
-        <w:gridCol w:w="2835"/>
-        <w:gridCol w:w="5669"/>
+        <w:gridCol w:w="567"/>
+        <w:gridCol w:w="1984"/>
+        <w:gridCol w:w="2608"/>
+        <w:gridCol w:w="879"/>
+        <w:gridCol w:w="992"/>
+        <w:gridCol w:w="1106"/>
+        <w:gridCol w:w="879"/>
+        <w:gridCol w:w="1191"/>
       </w:tblGrid>
       <w:tr>
         <w:tc>
           <w:tcPr>
-            <w:tcW w:type="dxa" w:w="4986"/>
-            <w:shd w:fill="16884A"/>
+            <w:tcW w:type="dxa" w:w="10206"/>
+            <w:gridSpan w:val="8"/>
             <w:vAlign w:val="center"/>
+            <w:tcMar>
+              <w:top w:w="90" w:type="dxa"/>
+              <w:bottom w:w="90" w:type="dxa"/>
+              <w:left w:w="120" w:type="dxa"/>
+              <w:right w:w="120" w:type="dxa"/>
+            </w:tcMar>
           </w:tcPr>
           <w:p>
             <w:pPr>
-              <w:spacing w:after="0"/>
-              <w:jc w:val="center"/>
-            </w:pPr>
-            <w:r/>
-            <w:r>
-              <w:rPr>
-                <w:rFonts w:ascii="Aptos" w:hAnsi="Aptos"/>
-                <w:b/>
-                <w:color w:val="FFFFFF"/>
-                <w:sz w:val="20"/>
-              </w:rPr>
-              <w:t>Startup</w:t>
-            </w:r>
-          </w:p>
-        </w:tc>
-        <w:tc>
-          <w:tcPr>
-            <w:tcW w:type="dxa" w:w="4986"/>
-            <w:shd w:fill="EAF7EF"/>
-            <w:vAlign w:val="center"/>
-          </w:tcPr>
-          <w:p>
-            <w:pPr>
-              <w:spacing w:after="0"/>
+              <w:spacing w:before="0" w:after="0" w:line="259" w:lineRule="auto"/>
               <w:jc w:val="left"/>
             </w:pPr>
             <w:r/>
             <w:r>
               <w:rPr>
-                <w:rFonts w:ascii="Aptos" w:hAnsi="Aptos"/>
+                <w:rFonts w:ascii="Arial" w:hAnsi="Arial"/>
                 <w:b/>
-                <w:color w:val="14231A"/>
-                <w:sz w:val="20"/>
+                <w:sz w:val="18"/>
               </w:rPr>
-              <w:t>Teralume</w:t>
+              <w:t>Participant Performance Report</w:t>
             </w:r>
           </w:p>
         </w:tc>
@@ -139,45 +60,111 @@
       <w:tr>
         <w:tc>
           <w:tcPr>
-            <w:tcW w:type="dxa" w:w="4986"/>
-            <w:shd w:fill="16884A"/>
+            <w:tcW w:type="dxa" w:w="2551"/>
+            <w:gridSpan w:val="2"/>
             <w:vAlign w:val="center"/>
+            <w:tcMar>
+              <w:top w:w="90" w:type="dxa"/>
+              <w:bottom w:w="90" w:type="dxa"/>
+              <w:left w:w="120" w:type="dxa"/>
+              <w:right w:w="120" w:type="dxa"/>
+            </w:tcMar>
           </w:tcPr>
           <w:p>
             <w:pPr>
-              <w:spacing w:after="0"/>
-              <w:jc w:val="center"/>
+              <w:spacing w:before="0" w:after="0" w:line="259" w:lineRule="auto"/>
+              <w:jc w:val="left"/>
             </w:pPr>
             <w:r/>
             <w:r>
               <w:rPr>
-                <w:rFonts w:ascii="Aptos" w:hAnsi="Aptos"/>
+                <w:rFonts w:ascii="Arial" w:hAnsi="Arial"/>
                 <w:b/>
-                <w:color w:val="FFFFFF"/>
-                <w:sz w:val="20"/>
+                <w:sz w:val="16"/>
               </w:rPr>
-              <w:t>Producto</w:t>
+              <w:t>Nombre de Startup</w:t>
             </w:r>
           </w:p>
         </w:tc>
         <w:tc>
           <w:tcPr>
-            <w:tcW w:type="dxa" w:w="4986"/>
-            <w:shd w:fill="EAF7EF"/>
+            <w:tcW w:type="dxa" w:w="3487"/>
+            <w:gridSpan w:val="2"/>
             <w:vAlign w:val="center"/>
+            <w:tcMar>
+              <w:top w:w="90" w:type="dxa"/>
+              <w:bottom w:w="90" w:type="dxa"/>
+              <w:left w:w="120" w:type="dxa"/>
+              <w:right w:w="120" w:type="dxa"/>
+            </w:tcMar>
           </w:tcPr>
           <w:p>
             <w:pPr>
-              <w:spacing w:after="0"/>
+              <w:spacing w:before="0" w:after="0" w:line="259" w:lineRule="auto"/>
               <w:jc w:val="left"/>
             </w:pPr>
             <w:r/>
             <w:r>
               <w:rPr>
-                <w:rFonts w:ascii="Aptos" w:hAnsi="Aptos"/>
+                <w:rFonts w:ascii="Arial" w:hAnsi="Arial"/>
+                <w:b w:val="0"/>
+                <w:sz w:val="16"/>
+              </w:rPr>
+              <w:t>Teralume</w:t>
+            </w:r>
+          </w:p>
+        </w:tc>
+        <w:tc>
+          <w:tcPr>
+            <w:tcW w:type="dxa" w:w="2098"/>
+            <w:gridSpan w:val="2"/>
+            <w:vAlign w:val="center"/>
+            <w:tcMar>
+              <w:top w:w="90" w:type="dxa"/>
+              <w:bottom w:w="90" w:type="dxa"/>
+              <w:left w:w="120" w:type="dxa"/>
+              <w:right w:w="120" w:type="dxa"/>
+            </w:tcMar>
+          </w:tcPr>
+          <w:p>
+            <w:pPr>
+              <w:spacing w:before="0" w:after="0" w:line="259" w:lineRule="auto"/>
+              <w:jc w:val="left"/>
+            </w:pPr>
+            <w:r/>
+            <w:r>
+              <w:rPr>
+                <w:rFonts w:ascii="Arial" w:hAnsi="Arial"/>
                 <w:b/>
-                <w:color w:val="14231A"/>
-                <w:sz w:val="20"/>
+                <w:sz w:val="16"/>
+              </w:rPr>
+              <w:t>Nombre de Producto</w:t>
+            </w:r>
+          </w:p>
+        </w:tc>
+        <w:tc>
+          <w:tcPr>
+            <w:tcW w:type="dxa" w:w="2070"/>
+            <w:gridSpan w:val="2"/>
+            <w:vAlign w:val="center"/>
+            <w:tcMar>
+              <w:top w:w="90" w:type="dxa"/>
+              <w:bottom w:w="90" w:type="dxa"/>
+              <w:left w:w="120" w:type="dxa"/>
+              <w:right w:w="120" w:type="dxa"/>
+            </w:tcMar>
+          </w:tcPr>
+          <w:p>
+            <w:pPr>
+              <w:spacing w:before="0" w:after="0" w:line="259" w:lineRule="auto"/>
+              <w:jc w:val="left"/>
+            </w:pPr>
+            <w:r/>
+            <w:r>
+              <w:rPr>
+                <w:rFonts w:ascii="Arial" w:hAnsi="Arial"/>
+                <w:b w:val="0"/>
+                <w:sz w:val="16"/>
               </w:rPr>
               <w:t>EnergyCore</w:t>
             </w:r>
@@ -187,47 +174,113 @@
       <w:tr>
         <w:tc>
           <w:tcPr>
-            <w:tcW w:type="dxa" w:w="4986"/>
-            <w:shd w:fill="16884A"/>
+            <w:tcW w:type="dxa" w:w="2551"/>
+            <w:gridSpan w:val="2"/>
             <w:vAlign w:val="center"/>
+            <w:tcMar>
+              <w:top w:w="90" w:type="dxa"/>
+              <w:bottom w:w="90" w:type="dxa"/>
+              <w:left w:w="120" w:type="dxa"/>
+              <w:right w:w="120" w:type="dxa"/>
+            </w:tcMar>
           </w:tcPr>
           <w:p>
             <w:pPr>
-              <w:spacing w:after="0"/>
-              <w:jc w:val="center"/>
+              <w:spacing w:before="0" w:after="0" w:line="259" w:lineRule="auto"/>
+              <w:jc w:val="left"/>
             </w:pPr>
             <w:r/>
             <w:r>
               <w:rPr>
-                <w:rFonts w:ascii="Aptos" w:hAnsi="Aptos"/>
+                <w:rFonts w:ascii="Arial" w:hAnsi="Arial"/>
                 <w:b/>
-                <w:color w:val="FFFFFF"/>
-                <w:sz w:val="20"/>
+                <w:sz w:val="16"/>
               </w:rPr>
-              <w:t>NRC / Entrega</w:t>
+              <w:t>Entrega</w:t>
             </w:r>
           </w:p>
         </w:tc>
         <w:tc>
           <w:tcPr>
-            <w:tcW w:type="dxa" w:w="4986"/>
-            <w:shd w:fill="EAF7EF"/>
+            <w:tcW w:type="dxa" w:w="3487"/>
+            <w:gridSpan w:val="2"/>
             <w:vAlign w:val="center"/>
+            <w:tcMar>
+              <w:top w:w="90" w:type="dxa"/>
+              <w:bottom w:w="90" w:type="dxa"/>
+              <w:left w:w="120" w:type="dxa"/>
+              <w:right w:w="120" w:type="dxa"/>
+            </w:tcMar>
           </w:tcPr>
           <w:p>
             <w:pPr>
-              <w:spacing w:after="0"/>
+              <w:spacing w:before="0" w:after="0" w:line="259" w:lineRule="auto"/>
               <w:jc w:val="left"/>
             </w:pPr>
             <w:r/>
             <w:r>
               <w:rPr>
-                <w:rFonts w:ascii="Aptos" w:hAnsi="Aptos"/>
+                <w:rFonts w:ascii="Arial" w:hAnsi="Arial"/>
+                <w:b w:val="0"/>
+                <w:sz w:val="16"/>
+              </w:rPr>
+              <w:t>AV1</w:t>
+            </w:r>
+          </w:p>
+        </w:tc>
+        <w:tc>
+          <w:tcPr>
+            <w:tcW w:type="dxa" w:w="2098"/>
+            <w:gridSpan w:val="2"/>
+            <w:vAlign w:val="center"/>
+            <w:tcMar>
+              <w:top w:w="90" w:type="dxa"/>
+              <w:bottom w:w="90" w:type="dxa"/>
+              <w:left w:w="120" w:type="dxa"/>
+              <w:right w:w="120" w:type="dxa"/>
+            </w:tcMar>
+          </w:tcPr>
+          <w:p>
+            <w:pPr>
+              <w:spacing w:before="0" w:after="0" w:line="259" w:lineRule="auto"/>
+              <w:jc w:val="left"/>
+            </w:pPr>
+            <w:r/>
+            <w:r>
+              <w:rPr>
+                <w:rFonts w:ascii="Arial" w:hAnsi="Arial"/>
                 <w:b/>
-                <w:color w:val="14231A"/>
-                <w:sz w:val="20"/>
+                <w:sz w:val="16"/>
               </w:rPr>
-              <w:t>9100 / AV1</w:t>
+              <w:t>Team Leader</w:t>
+            </w:r>
+          </w:p>
+        </w:tc>
+        <w:tc>
+          <w:tcPr>
+            <w:tcW w:type="dxa" w:w="2070"/>
+            <w:gridSpan w:val="2"/>
+            <w:vAlign w:val="center"/>
+            <w:tcMar>
+              <w:top w:w="90" w:type="dxa"/>
+              <w:bottom w:w="90" w:type="dxa"/>
+              <w:left w:w="120" w:type="dxa"/>
+              <w:right w:w="120" w:type="dxa"/>
+            </w:tcMar>
+          </w:tcPr>
+          <w:p>
+            <w:pPr>
+              <w:spacing w:before="0" w:after="0" w:line="259" w:lineRule="auto"/>
+              <w:jc w:val="left"/>
+            </w:pPr>
+            <w:r/>
+            <w:r>
+              <w:rPr>
+                <w:rFonts w:ascii="Arial" w:hAnsi="Arial"/>
+                <w:b w:val="0"/>
+                <w:sz w:val="16"/>
+              </w:rPr>
+              <w:t>Loa Rojas, Jean Franck</w:t>
             </w:r>
           </w:p>
         </w:tc>
@@ -235,209 +288,26 @@
       <w:tr>
         <w:tc>
           <w:tcPr>
-            <w:tcW w:type="dxa" w:w="4986"/>
-            <w:shd w:fill="16884A"/>
+            <w:tcW w:type="dxa" w:w="567"/>
             <w:vAlign w:val="center"/>
+            <w:tcMar>
+              <w:top w:w="90" w:type="dxa"/>
+              <w:bottom w:w="90" w:type="dxa"/>
+              <w:left w:w="120" w:type="dxa"/>
+              <w:right w:w="120" w:type="dxa"/>
+            </w:tcMar>
           </w:tcPr>
           <w:p>
             <w:pPr>
-              <w:spacing w:after="0"/>
+              <w:spacing w:before="0" w:after="0" w:line="259" w:lineRule="auto"/>
               <w:jc w:val="center"/>
             </w:pPr>
             <w:r/>
             <w:r>
               <w:rPr>
-                <w:rFonts w:ascii="Aptos" w:hAnsi="Aptos"/>
+                <w:rFonts w:ascii="Arial" w:hAnsi="Arial"/>
                 <w:b/>
-                <w:color w:val="FFFFFF"/>
-                <w:sz w:val="20"/>
-              </w:rPr>
-              <w:t>Docente</w:t>
-            </w:r>
-          </w:p>
-        </w:tc>
-        <w:tc>
-          <w:tcPr>
-            <w:tcW w:type="dxa" w:w="4986"/>
-            <w:shd w:fill="EAF7EF"/>
-            <w:vAlign w:val="center"/>
-          </w:tcPr>
-          <w:p>
-            <w:pPr>
-              <w:spacing w:after="0"/>
-              <w:jc w:val="left"/>
-            </w:pPr>
-            <w:r/>
-            <w:r>
-              <w:rPr>
-                <w:rFonts w:ascii="Aptos" w:hAnsi="Aptos"/>
-                <w:b/>
-                <w:color w:val="14231A"/>
-                <w:sz w:val="20"/>
-              </w:rPr>
-              <w:t>Alex Humberto Sánchez Ponce</w:t>
-            </w:r>
-          </w:p>
-        </w:tc>
-      </w:tr>
-    </w:tbl>
-    <w:p/>
-    <w:p>
-      <w:pPr>
-        <w:jc w:val="center"/>
-      </w:pPr>
-      <w:r>
-        <w:rPr>
-          <w:b/>
-          <w:sz w:val="24"/>
-        </w:rPr>
-        <w:t>Jean Franck Loa Rojas  ·  U20241E406  ·  Séptimo ciclo</w:t>
-      </w:r>
-    </w:p>
-    <w:p>
-      <w:pPr>
-        <w:jc w:val="center"/>
-      </w:pPr>
-      <w:r>
-        <w:rPr>
-          <w:i/>
-          <w:color w:val="5F6B63"/>
-          <w:sz w:val="18"/>
-        </w:rPr>
-        <w:t>Documento elaborado siguiendo la estructura del Anexo B del enunciado del curso.</w:t>
-      </w:r>
-    </w:p>
-    <w:p>
-      <w:pPr>
-        <w:sectPr>
-          <w:headerReference w:type="default" r:id="rId9"/>
-          <w:footerReference w:type="default" r:id="rId10"/>
-          <w:pgSz w:w="12240" w:h="15840"/>
-          <w:pgMar w:top="1020" w:right="1134" w:bottom="907" w:left="1134" w:header="720" w:footer="720" w:gutter="0"/>
-          <w:cols w:space="720"/>
-          <w:docGrid w:linePitch="360"/>
-        </w:sectPr>
-      </w:pPr>
-    </w:p>
-    <w:p>
-      <w:r>
-        <w:rPr>
-          <w:b/>
-          <w:color w:val="14231A"/>
-          <w:sz w:val="42"/>
-        </w:rPr>
-        <w:t>Evaluación individual del participante</w:t>
-      </w:r>
-    </w:p>
-    <w:p>
-      <w:pPr>
-        <w:spacing w:after="80"/>
-      </w:pPr>
-      <w:r>
-        <w:rPr>
-          <w:b/>
-          <w:color w:val="16884A"/>
-        </w:rPr>
-        <w:t xml:space="preserve">Startup Name: </w:t>
-      </w:r>
-      <w:r>
-        <w:rPr>
-          <w:color w:val="14231A"/>
-        </w:rPr>
-        <w:t>Teralume</w:t>
-      </w:r>
-    </w:p>
-    <w:p>
-      <w:pPr>
-        <w:spacing w:after="80"/>
-      </w:pPr>
-      <w:r>
-        <w:rPr>
-          <w:b/>
-          <w:color w:val="16884A"/>
-        </w:rPr>
-        <w:t xml:space="preserve">Product Name: </w:t>
-      </w:r>
-      <w:r>
-        <w:rPr>
-          <w:color w:val="14231A"/>
-        </w:rPr>
-        <w:t>EnergyCore</w:t>
-      </w:r>
-    </w:p>
-    <w:p>
-      <w:pPr>
-        <w:spacing w:after="80"/>
-      </w:pPr>
-      <w:r>
-        <w:rPr>
-          <w:b/>
-          <w:color w:val="16884A"/>
-        </w:rPr>
-        <w:t xml:space="preserve">Delivery: </w:t>
-      </w:r>
-      <w:r>
-        <w:rPr>
-          <w:color w:val="14231A"/>
-        </w:rPr>
-        <w:t>AV1</w:t>
-      </w:r>
-    </w:p>
-    <w:p>
-      <w:pPr>
-        <w:spacing w:after="80"/>
-      </w:pPr>
-      <w:r>
-        <w:rPr>
-          <w:b/>
-          <w:color w:val="16884A"/>
-        </w:rPr>
-        <w:t xml:space="preserve">Team Leader: </w:t>
-      </w:r>
-      <w:r>
-        <w:rPr>
-          <w:color w:val="14231A"/>
-        </w:rPr>
-        <w:t>Jean Franck Loa Rojas — U20241E406</w:t>
-      </w:r>
-    </w:p>
-    <w:p/>
-    <w:tbl>
-      <w:tblPr>
-        <w:tblStyle w:val="TableGrid"/>
-        <w:tblW w:type="auto" w:w="0"/>
-        <w:jc w:val="center"/>
-        <w:tblLook w:firstColumn="1" w:firstRow="1" w:lastColumn="0" w:lastRow="0" w:noHBand="0" w:noVBand="1" w:val="04A0"/>
-      </w:tblPr>
-      <w:tblGrid>
-        <w:gridCol w:w="1331"/>
-        <w:gridCol w:w="1331"/>
-        <w:gridCol w:w="1331"/>
-        <w:gridCol w:w="1331"/>
-        <w:gridCol w:w="1331"/>
-        <w:gridCol w:w="1331"/>
-        <w:gridCol w:w="1331"/>
-        <w:gridCol w:w="1331"/>
-      </w:tblGrid>
-      <w:tr>
-        <w:tc>
-          <w:tcPr>
-            <w:tcW w:type="dxa" w:w="397"/>
-            <w:shd w:fill="16884A"/>
-            <w:vAlign w:val="center"/>
-          </w:tcPr>
-          <w:p>
-            <w:pPr>
-              <w:spacing w:after="0"/>
-              <w:jc w:val="center"/>
-            </w:pPr>
-            <w:r/>
-            <w:r>
-              <w:rPr>
-                <w:rFonts w:ascii="Aptos" w:hAnsi="Aptos"/>
-                <w:b/>
-                <w:color w:val="FFFFFF"/>
-                <w:sz w:val="15"/>
+                <w:sz w:val="12"/>
               </w:rPr>
               <w:t>Ítem</w:t>
             </w:r>
@@ -445,22 +315,26 @@
         </w:tc>
         <w:tc>
           <w:tcPr>
-            <w:tcW w:type="dxa" w:w="1587"/>
-            <w:shd w:fill="16884A"/>
+            <w:tcW w:type="dxa" w:w="1984"/>
             <w:vAlign w:val="center"/>
+            <w:tcMar>
+              <w:top w:w="90" w:type="dxa"/>
+              <w:bottom w:w="90" w:type="dxa"/>
+              <w:left w:w="120" w:type="dxa"/>
+              <w:right w:w="120" w:type="dxa"/>
+            </w:tcMar>
           </w:tcPr>
           <w:p>
             <w:pPr>
-              <w:spacing w:after="0"/>
+              <w:spacing w:before="0" w:after="0" w:line="259" w:lineRule="auto"/>
               <w:jc w:val="center"/>
             </w:pPr>
             <w:r/>
             <w:r>
               <w:rPr>
-                <w:rFonts w:ascii="Aptos" w:hAnsi="Aptos"/>
+                <w:rFonts w:ascii="Arial" w:hAnsi="Arial"/>
                 <w:b/>
-                <w:color w:val="FFFFFF"/>
-                <w:sz w:val="15"/>
+                <w:sz w:val="12"/>
               </w:rPr>
               <w:t>Estudiante</w:t>
             </w:r>
@@ -468,45 +342,53 @@
         </w:tc>
         <w:tc>
           <w:tcPr>
-            <w:tcW w:type="dxa" w:w="4422"/>
-            <w:shd w:fill="16884A"/>
+            <w:tcW w:type="dxa" w:w="2608"/>
             <w:vAlign w:val="center"/>
+            <w:tcMar>
+              <w:top w:w="90" w:type="dxa"/>
+              <w:bottom w:w="90" w:type="dxa"/>
+              <w:left w:w="120" w:type="dxa"/>
+              <w:right w:w="120" w:type="dxa"/>
+            </w:tcMar>
           </w:tcPr>
           <w:p>
             <w:pPr>
-              <w:spacing w:after="0"/>
+              <w:spacing w:before="0" w:after="0" w:line="259" w:lineRule="auto"/>
               <w:jc w:val="center"/>
             </w:pPr>
             <w:r/>
             <w:r>
               <w:rPr>
-                <w:rFonts w:ascii="Aptos" w:hAnsi="Aptos"/>
+                <w:rFonts w:ascii="Arial" w:hAnsi="Arial"/>
                 <w:b/>
-                <w:color w:val="FFFFFF"/>
-                <w:sz w:val="15"/>
+                <w:sz w:val="12"/>
               </w:rPr>
-              <w:t>Responsabilidades asignadas</w:t>
+              <w:t>Responsabilidades</w:t>
             </w:r>
           </w:p>
         </w:tc>
         <w:tc>
           <w:tcPr>
-            <w:tcW w:type="dxa" w:w="964"/>
-            <w:shd w:fill="16884A"/>
+            <w:tcW w:type="dxa" w:w="879"/>
             <w:vAlign w:val="center"/>
+            <w:tcMar>
+              <w:top w:w="90" w:type="dxa"/>
+              <w:bottom w:w="90" w:type="dxa"/>
+              <w:left w:w="120" w:type="dxa"/>
+              <w:right w:w="120" w:type="dxa"/>
+            </w:tcMar>
           </w:tcPr>
           <w:p>
             <w:pPr>
-              <w:spacing w:after="0"/>
+              <w:spacing w:before="0" w:after="0" w:line="259" w:lineRule="auto"/>
               <w:jc w:val="center"/>
             </w:pPr>
             <w:r/>
             <w:r>
               <w:rPr>
-                <w:rFonts w:ascii="Aptos" w:hAnsi="Aptos"/>
+                <w:rFonts w:ascii="Arial" w:hAnsi="Arial"/>
                 <w:b/>
-                <w:color w:val="FFFFFF"/>
-                <w:sz w:val="15"/>
+                <w:sz w:val="12"/>
               </w:rPr>
               <w:t>Cumplió a tiempo</w:t>
             </w:r>
@@ -514,45 +396,53 @@
         </w:tc>
         <w:tc>
           <w:tcPr>
-            <w:tcW w:type="dxa" w:w="850"/>
-            <w:shd w:fill="16884A"/>
+            <w:tcW w:type="dxa" w:w="992"/>
             <w:vAlign w:val="center"/>
+            <w:tcMar>
+              <w:top w:w="90" w:type="dxa"/>
+              <w:bottom w:w="90" w:type="dxa"/>
+              <w:left w:w="120" w:type="dxa"/>
+              <w:right w:w="120" w:type="dxa"/>
+            </w:tcMar>
           </w:tcPr>
           <w:p>
             <w:pPr>
-              <w:spacing w:after="0"/>
+              <w:spacing w:before="0" w:after="0" w:line="259" w:lineRule="auto"/>
               <w:jc w:val="center"/>
             </w:pPr>
             <w:r/>
             <w:r>
               <w:rPr>
-                <w:rFonts w:ascii="Aptos" w:hAnsi="Aptos"/>
+                <w:rFonts w:ascii="Arial" w:hAnsi="Arial"/>
                 <w:b/>
-                <w:color w:val="FFFFFF"/>
-                <w:sz w:val="15"/>
+                <w:sz w:val="12"/>
               </w:rPr>
-              <w:t>Cumplió tarde</w:t>
+              <w:t>Cumplió a destiempo</w:t>
             </w:r>
           </w:p>
         </w:tc>
         <w:tc>
           <w:tcPr>
-            <w:tcW w:type="dxa" w:w="1020"/>
-            <w:shd w:fill="16884A"/>
+            <w:tcW w:type="dxa" w:w="1106"/>
             <w:vAlign w:val="center"/>
+            <w:tcMar>
+              <w:top w:w="90" w:type="dxa"/>
+              <w:bottom w:w="90" w:type="dxa"/>
+              <w:left w:w="120" w:type="dxa"/>
+              <w:right w:w="120" w:type="dxa"/>
+            </w:tcMar>
           </w:tcPr>
           <w:p>
             <w:pPr>
-              <w:spacing w:after="0"/>
+              <w:spacing w:before="0" w:after="0" w:line="259" w:lineRule="auto"/>
               <w:jc w:val="center"/>
             </w:pPr>
             <w:r/>
             <w:r>
               <w:rPr>
-                <w:rFonts w:ascii="Aptos" w:hAnsi="Aptos"/>
+                <w:rFonts w:ascii="Arial" w:hAnsi="Arial"/>
                 <w:b/>
-                <w:color w:val="FFFFFF"/>
-                <w:sz w:val="15"/>
+                <w:sz w:val="12"/>
               </w:rPr>
               <w:t>Cumplió parcialmente</w:t>
             </w:r>
@@ -560,47 +450,55 @@
         </w:tc>
         <w:tc>
           <w:tcPr>
-            <w:tcW w:type="dxa" w:w="794"/>
-            <w:shd w:fill="16884A"/>
+            <w:tcW w:type="dxa" w:w="879"/>
             <w:vAlign w:val="center"/>
+            <w:tcMar>
+              <w:top w:w="90" w:type="dxa"/>
+              <w:bottom w:w="90" w:type="dxa"/>
+              <w:left w:w="120" w:type="dxa"/>
+              <w:right w:w="120" w:type="dxa"/>
+            </w:tcMar>
           </w:tcPr>
           <w:p>
             <w:pPr>
-              <w:spacing w:after="0"/>
+              <w:spacing w:before="0" w:after="0" w:line="259" w:lineRule="auto"/>
               <w:jc w:val="center"/>
             </w:pPr>
             <w:r/>
             <w:r>
               <w:rPr>
-                <w:rFonts w:ascii="Aptos" w:hAnsi="Aptos"/>
+                <w:rFonts w:ascii="Arial" w:hAnsi="Arial"/>
                 <w:b/>
-                <w:color w:val="FFFFFF"/>
-                <w:sz w:val="15"/>
+                <w:sz w:val="12"/>
               </w:rPr>
-              <w:t>No cumplió</w:t>
+              <w:t>No cumplió (Cero)</w:t>
             </w:r>
           </w:p>
         </w:tc>
         <w:tc>
           <w:tcPr>
-            <w:tcW w:type="dxa" w:w="567"/>
-            <w:shd w:fill="16884A"/>
+            <w:tcW w:type="dxa" w:w="1191"/>
             <w:vAlign w:val="center"/>
+            <w:tcMar>
+              <w:top w:w="90" w:type="dxa"/>
+              <w:bottom w:w="90" w:type="dxa"/>
+              <w:left w:w="120" w:type="dxa"/>
+              <w:right w:w="120" w:type="dxa"/>
+            </w:tcMar>
           </w:tcPr>
           <w:p>
             <w:pPr>
-              <w:spacing w:after="0"/>
+              <w:spacing w:before="0" w:after="0" w:line="259" w:lineRule="auto"/>
               <w:jc w:val="center"/>
             </w:pPr>
             <w:r/>
             <w:r>
               <w:rPr>
-                <w:rFonts w:ascii="Aptos" w:hAnsi="Aptos"/>
+                <w:rFonts w:ascii="Arial" w:hAnsi="Arial"/>
                 <w:b/>
-                <w:color w:val="FFFFFF"/>
-                <w:sz w:val="15"/>
+                <w:sz w:val="12"/>
               </w:rPr>
-              <w:t>Nota</w:t>
+              <w:t>Calificación asignada (20 / 16 / 13 / 07 / 0)</w:t>
             </w:r>
           </w:p>
         </w:tc>
@@ -608,22 +506,27 @@
       <w:tr>
         <w:tc>
           <w:tcPr>
-            <w:tcW w:type="dxa" w:w="1331"/>
-            <w:shd w:fill="EAF7EF"/>
+            <w:tcW w:type="dxa" w:w="567"/>
+            <w:vMerge w:val="restart"/>
             <w:vAlign w:val="center"/>
+            <w:tcMar>
+              <w:top w:w="90" w:type="dxa"/>
+              <w:bottom w:w="90" w:type="dxa"/>
+              <w:left w:w="120" w:type="dxa"/>
+              <w:right w:w="120" w:type="dxa"/>
+            </w:tcMar>
           </w:tcPr>
           <w:p>
             <w:pPr>
-              <w:spacing w:after="0"/>
+              <w:spacing w:before="0" w:after="0" w:line="259" w:lineRule="auto"/>
               <w:jc w:val="center"/>
             </w:pPr>
             <w:r/>
             <w:r>
               <w:rPr>
-                <w:rFonts w:ascii="Aptos" w:hAnsi="Aptos"/>
-                <w:b/>
-                <w:color w:val="14231A"/>
-                <w:sz w:val="17"/>
+                <w:rFonts w:ascii="Arial" w:hAnsi="Arial"/>
+                <w:b w:val="0"/>
+                <w:sz w:val="16"/>
               </w:rPr>
               <w:t>1</w:t>
             </w:r>
@@ -631,24 +534,29 @@
         </w:tc>
         <w:tc>
           <w:tcPr>
-            <w:tcW w:type="dxa" w:w="1331"/>
-            <w:shd w:fill="FFFFFF"/>
+            <w:tcW w:type="dxa" w:w="1984"/>
+            <w:vMerge w:val="restart"/>
             <w:vAlign w:val="center"/>
+            <w:tcMar>
+              <w:top w:w="90" w:type="dxa"/>
+              <w:bottom w:w="90" w:type="dxa"/>
+              <w:left w:w="120" w:type="dxa"/>
+              <w:right w:w="120" w:type="dxa"/>
+            </w:tcMar>
           </w:tcPr>
           <w:p>
             <w:pPr>
-              <w:spacing w:after="0"/>
-              <w:jc w:val="left"/>
+              <w:spacing w:before="0" w:after="0" w:line="259" w:lineRule="auto"/>
+              <w:jc w:val="center"/>
             </w:pPr>
             <w:r/>
             <w:r>
               <w:rPr>
-                <w:rFonts w:ascii="Aptos" w:hAnsi="Aptos"/>
-                <w:b/>
-                <w:color w:val="14231A"/>
-                <w:sz w:val="17"/>
+                <w:rFonts w:ascii="Arial" w:hAnsi="Arial"/>
+                <w:b w:val="0"/>
+                <w:sz w:val="14"/>
               </w:rPr>
-              <w:t>Jean Franck Loa Rojas</w:t>
+              <w:t>Loa Rojas, Jean Franck</w:t>
               <w:br/>
               <w:t>U20241E406</w:t>
             </w:r>
@@ -656,45 +564,53 @@
         </w:tc>
         <w:tc>
           <w:tcPr>
-            <w:tcW w:type="dxa" w:w="1331"/>
-            <w:shd w:fill="FFFFFF"/>
+            <w:tcW w:type="dxa" w:w="2608"/>
             <w:vAlign w:val="center"/>
+            <w:tcMar>
+              <w:top w:w="90" w:type="dxa"/>
+              <w:bottom w:w="90" w:type="dxa"/>
+              <w:left w:w="120" w:type="dxa"/>
+              <w:right w:w="120" w:type="dxa"/>
+            </w:tcMar>
           </w:tcPr>
           <w:p>
             <w:pPr>
-              <w:spacing w:after="0"/>
+              <w:spacing w:before="0" w:after="0" w:line="259" w:lineRule="auto"/>
               <w:jc w:val="left"/>
             </w:pPr>
             <w:r/>
             <w:r>
               <w:rPr>
-                <w:rFonts w:ascii="Aptos" w:hAnsi="Aptos"/>
+                <w:rFonts w:ascii="Arial" w:hAnsi="Arial"/>
                 <w:b w:val="0"/>
-                <w:color w:val="14231A"/>
                 <w:sz w:val="16"/>
               </w:rPr>
-              <w:t>Configuración de repositorios y GitFlow; rebranding ElectroCorp → EnergyCore; arquitectura DDD y REST API; frontend Angular; Landing Page; aplicación Flutter Android; diseño UX/UI; pruebas; documentación y preparación de despliegue Cloud Run, Firebase y Neon.</w:t>
+              <w:t>Integración de los repositorios, arquitectura de la API y adaptación del producto EnergyCore.</w:t>
             </w:r>
           </w:p>
         </w:tc>
         <w:tc>
           <w:tcPr>
-            <w:tcW w:type="dxa" w:w="1331"/>
-            <w:shd w:fill="EAF7EF"/>
+            <w:tcW w:type="dxa" w:w="879"/>
             <w:vAlign w:val="center"/>
+            <w:tcMar>
+              <w:top w:w="90" w:type="dxa"/>
+              <w:bottom w:w="90" w:type="dxa"/>
+              <w:left w:w="120" w:type="dxa"/>
+              <w:right w:w="120" w:type="dxa"/>
+            </w:tcMar>
           </w:tcPr>
           <w:p>
             <w:pPr>
-              <w:spacing w:after="0"/>
+              <w:spacing w:before="0" w:after="0" w:line="259" w:lineRule="auto"/>
               <w:jc w:val="center"/>
             </w:pPr>
             <w:r/>
             <w:r>
               <w:rPr>
-                <w:rFonts w:ascii="Aptos" w:hAnsi="Aptos"/>
+                <w:rFonts w:ascii="Arial" w:hAnsi="Arial"/>
                 <w:b/>
-                <w:color w:val="16884A"/>
-                <w:sz w:val="17"/>
+                <w:sz w:val="16"/>
               </w:rPr>
               <w:t>X</w:t>
             </w:r>
@@ -702,88 +618,969 @@
         </w:tc>
         <w:tc>
           <w:tcPr>
-            <w:tcW w:type="dxa" w:w="1331"/>
-            <w:shd w:fill="FFFFFF"/>
+            <w:tcW w:type="dxa" w:w="992"/>
+          </w:tcPr>
+          <w:p/>
+        </w:tc>
+        <w:tc>
+          <w:tcPr>
+            <w:tcW w:type="dxa" w:w="1106"/>
+          </w:tcPr>
+          <w:p/>
+        </w:tc>
+        <w:tc>
+          <w:tcPr>
+            <w:tcW w:type="dxa" w:w="879"/>
+          </w:tcPr>
+          <w:p/>
+        </w:tc>
+        <w:tc>
+          <w:tcPr>
+            <w:tcW w:type="dxa" w:w="1191"/>
+            <w:vMerge w:val="restart"/>
             <w:vAlign w:val="center"/>
+            <w:tcMar>
+              <w:top w:w="90" w:type="dxa"/>
+              <w:bottom w:w="90" w:type="dxa"/>
+              <w:left w:w="120" w:type="dxa"/>
+              <w:right w:w="120" w:type="dxa"/>
+            </w:tcMar>
           </w:tcPr>
           <w:p>
             <w:pPr>
-              <w:spacing w:after="0"/>
+              <w:spacing w:before="0" w:after="0" w:line="259" w:lineRule="auto"/>
               <w:jc w:val="center"/>
             </w:pPr>
             <w:r/>
             <w:r>
               <w:rPr>
-                <w:rFonts w:ascii="Aptos" w:hAnsi="Aptos"/>
+                <w:rFonts w:ascii="Arial" w:hAnsi="Arial"/>
+                <w:b/>
+                <w:sz w:val="16"/>
+              </w:rPr>
+              <w:t>20</w:t>
+            </w:r>
+          </w:p>
+        </w:tc>
+      </w:tr>
+      <w:tr>
+        <w:tc>
+          <w:tcPr>
+            <w:tcW w:type="dxa" w:w="567"/>
+            <w:vMerge/>
+          </w:tcPr>
+          <w:p/>
+        </w:tc>
+        <w:tc>
+          <w:tcPr>
+            <w:tcW w:type="dxa" w:w="1984"/>
+            <w:vMerge/>
+          </w:tcPr>
+          <w:p/>
+        </w:tc>
+        <w:tc>
+          <w:tcPr>
+            <w:tcW w:type="dxa" w:w="2608"/>
+            <w:vAlign w:val="center"/>
+            <w:tcMar>
+              <w:top w:w="90" w:type="dxa"/>
+              <w:bottom w:w="90" w:type="dxa"/>
+              <w:left w:w="120" w:type="dxa"/>
+              <w:right w:w="120" w:type="dxa"/>
+            </w:tcMar>
+          </w:tcPr>
+          <w:p>
+            <w:pPr>
+              <w:spacing w:before="0" w:after="0" w:line="259" w:lineRule="auto"/>
+              <w:jc w:val="left"/>
+            </w:pPr>
+            <w:r/>
+            <w:r>
+              <w:rPr>
+                <w:rFonts w:ascii="Arial" w:hAnsi="Arial"/>
                 <w:b w:val="0"/>
-                <w:color w:val="14231A"/>
-                <w:sz w:val="17"/>
+                <w:sz w:val="16"/>
               </w:rPr>
+              <w:t>Desarrollo y verificación de la aplicación web, Landing Page y aplicación móvil Flutter.</w:t>
             </w:r>
           </w:p>
         </w:tc>
         <w:tc>
           <w:tcPr>
-            <w:tcW w:type="dxa" w:w="1331"/>
-            <w:shd w:fill="FFFFFF"/>
+            <w:tcW w:type="dxa" w:w="879"/>
             <w:vAlign w:val="center"/>
+            <w:tcMar>
+              <w:top w:w="90" w:type="dxa"/>
+              <w:bottom w:w="90" w:type="dxa"/>
+              <w:left w:w="120" w:type="dxa"/>
+              <w:right w:w="120" w:type="dxa"/>
+            </w:tcMar>
           </w:tcPr>
           <w:p>
             <w:pPr>
-              <w:spacing w:after="0"/>
+              <w:spacing w:before="0" w:after="0" w:line="259" w:lineRule="auto"/>
               <w:jc w:val="center"/>
             </w:pPr>
             <w:r/>
             <w:r>
               <w:rPr>
-                <w:rFonts w:ascii="Aptos" w:hAnsi="Aptos"/>
-                <w:b w:val="0"/>
-                <w:color w:val="14231A"/>
-                <w:sz w:val="17"/>
+                <w:rFonts w:ascii="Arial" w:hAnsi="Arial"/>
+                <w:b/>
+                <w:sz w:val="16"/>
               </w:rPr>
+              <w:t>X</w:t>
             </w:r>
           </w:p>
         </w:tc>
         <w:tc>
           <w:tcPr>
-            <w:tcW w:type="dxa" w:w="1331"/>
-            <w:shd w:fill="FFFFFF"/>
+            <w:tcW w:type="dxa" w:w="992"/>
+          </w:tcPr>
+          <w:p/>
+        </w:tc>
+        <w:tc>
+          <w:tcPr>
+            <w:tcW w:type="dxa" w:w="1106"/>
+          </w:tcPr>
+          <w:p/>
+        </w:tc>
+        <w:tc>
+          <w:tcPr>
+            <w:tcW w:type="dxa" w:w="879"/>
+          </w:tcPr>
+          <w:p/>
+        </w:tc>
+        <w:tc>
+          <w:tcPr>
+            <w:tcW w:type="dxa" w:w="1191"/>
+            <w:vMerge/>
+          </w:tcPr>
+          <w:p/>
+        </w:tc>
+      </w:tr>
+      <w:tr>
+        <w:tc>
+          <w:tcPr>
+            <w:tcW w:type="dxa" w:w="567"/>
+            <w:vMerge/>
+          </w:tcPr>
+          <w:p/>
+        </w:tc>
+        <w:tc>
+          <w:tcPr>
+            <w:tcW w:type="dxa" w:w="1984"/>
+            <w:vMerge/>
+          </w:tcPr>
+          <w:p/>
+        </w:tc>
+        <w:tc>
+          <w:tcPr>
+            <w:tcW w:type="dxa" w:w="2608"/>
             <w:vAlign w:val="center"/>
+            <w:tcMar>
+              <w:top w:w="90" w:type="dxa"/>
+              <w:bottom w:w="90" w:type="dxa"/>
+              <w:left w:w="120" w:type="dxa"/>
+              <w:right w:w="120" w:type="dxa"/>
+            </w:tcMar>
           </w:tcPr>
           <w:p>
             <w:pPr>
-              <w:spacing w:after="0"/>
+              <w:spacing w:before="0" w:after="0" w:line="259" w:lineRule="auto"/>
+              <w:jc w:val="left"/>
+            </w:pPr>
+            <w:r/>
+            <w:r>
+              <w:rPr>
+                <w:rFonts w:ascii="Arial" w:hAnsi="Arial"/>
+                <w:b w:val="0"/>
+                <w:sz w:val="16"/>
+              </w:rPr>
+              <w:t>Documentación del proyecto, Student Outcome ABET y evidencias técnicas de AV1.</w:t>
+            </w:r>
+          </w:p>
+        </w:tc>
+        <w:tc>
+          <w:tcPr>
+            <w:tcW w:type="dxa" w:w="879"/>
+            <w:vAlign w:val="center"/>
+            <w:tcMar>
+              <w:top w:w="90" w:type="dxa"/>
+              <w:bottom w:w="90" w:type="dxa"/>
+              <w:left w:w="120" w:type="dxa"/>
+              <w:right w:w="120" w:type="dxa"/>
+            </w:tcMar>
+          </w:tcPr>
+          <w:p>
+            <w:pPr>
+              <w:spacing w:before="0" w:after="0" w:line="259" w:lineRule="auto"/>
               <w:jc w:val="center"/>
             </w:pPr>
             <w:r/>
             <w:r>
               <w:rPr>
-                <w:rFonts w:ascii="Aptos" w:hAnsi="Aptos"/>
-                <w:b w:val="0"/>
-                <w:color w:val="14231A"/>
-                <w:sz w:val="17"/>
+                <w:rFonts w:ascii="Arial" w:hAnsi="Arial"/>
+                <w:b/>
+                <w:sz w:val="16"/>
               </w:rPr>
+              <w:t>X</w:t>
             </w:r>
           </w:p>
         </w:tc>
         <w:tc>
           <w:tcPr>
-            <w:tcW w:type="dxa" w:w="1331"/>
-            <w:shd w:fill="EAF7EF"/>
+            <w:tcW w:type="dxa" w:w="992"/>
+          </w:tcPr>
+          <w:p/>
+        </w:tc>
+        <w:tc>
+          <w:tcPr>
+            <w:tcW w:type="dxa" w:w="1106"/>
+          </w:tcPr>
+          <w:p/>
+        </w:tc>
+        <w:tc>
+          <w:tcPr>
+            <w:tcW w:type="dxa" w:w="879"/>
+          </w:tcPr>
+          <w:p/>
+        </w:tc>
+        <w:tc>
+          <w:tcPr>
+            <w:tcW w:type="dxa" w:w="1191"/>
+            <w:vMerge/>
+          </w:tcPr>
+          <w:p/>
+        </w:tc>
+      </w:tr>
+      <w:tr>
+        <w:tc>
+          <w:tcPr>
+            <w:tcW w:type="dxa" w:w="567"/>
+            <w:vMerge w:val="restart"/>
             <w:vAlign w:val="center"/>
+            <w:tcMar>
+              <w:top w:w="90" w:type="dxa"/>
+              <w:bottom w:w="90" w:type="dxa"/>
+              <w:left w:w="120" w:type="dxa"/>
+              <w:right w:w="120" w:type="dxa"/>
+            </w:tcMar>
           </w:tcPr>
           <w:p>
             <w:pPr>
-              <w:spacing w:after="0"/>
+              <w:spacing w:before="0" w:after="0" w:line="259" w:lineRule="auto"/>
               <w:jc w:val="center"/>
             </w:pPr>
             <w:r/>
             <w:r>
               <w:rPr>
-                <w:rFonts w:ascii="Aptos" w:hAnsi="Aptos"/>
+                <w:rFonts w:ascii="Arial" w:hAnsi="Arial"/>
+                <w:b w:val="0"/>
+                <w:sz w:val="16"/>
+              </w:rPr>
+              <w:t>2</w:t>
+            </w:r>
+          </w:p>
+        </w:tc>
+        <w:tc>
+          <w:tcPr>
+            <w:tcW w:type="dxa" w:w="1984"/>
+            <w:vMerge w:val="restart"/>
+            <w:vAlign w:val="center"/>
+            <w:tcMar>
+              <w:top w:w="90" w:type="dxa"/>
+              <w:bottom w:w="90" w:type="dxa"/>
+              <w:left w:w="120" w:type="dxa"/>
+              <w:right w:w="120" w:type="dxa"/>
+            </w:tcMar>
+          </w:tcPr>
+          <w:p>
+            <w:pPr>
+              <w:spacing w:before="0" w:after="0" w:line="259" w:lineRule="auto"/>
+              <w:jc w:val="center"/>
+            </w:pPr>
+            <w:r/>
+            <w:r>
+              <w:rPr>
+                <w:rFonts w:ascii="Arial" w:hAnsi="Arial"/>
+                <w:b w:val="0"/>
+                <w:sz w:val="14"/>
+              </w:rPr>
+              <w:t>Jairo Mathias Santiago Atanacio</w:t>
+              <w:br/>
+              <w:t>U202418755</w:t>
+              <w:br/>
+              <w:t>u202418755@upc.edu.pe</w:t>
+            </w:r>
+          </w:p>
+        </w:tc>
+        <w:tc>
+          <w:tcPr>
+            <w:tcW w:type="dxa" w:w="2608"/>
+            <w:vAlign w:val="center"/>
+            <w:tcMar>
+              <w:top w:w="90" w:type="dxa"/>
+              <w:bottom w:w="90" w:type="dxa"/>
+              <w:left w:w="120" w:type="dxa"/>
+              <w:right w:w="120" w:type="dxa"/>
+            </w:tcMar>
+          </w:tcPr>
+          <w:p>
+            <w:pPr>
+              <w:spacing w:before="0" w:after="0" w:line="259" w:lineRule="auto"/>
+              <w:jc w:val="left"/>
+            </w:pPr>
+            <w:r/>
+            <w:r>
+              <w:rPr>
+                <w:rFonts w:ascii="Arial" w:hAnsi="Arial"/>
+                <w:b w:val="0"/>
+                <w:sz w:val="16"/>
+              </w:rPr>
+              <w:t>Incorporación y actualización de su perfil en el Project Report.</w:t>
+            </w:r>
+          </w:p>
+        </w:tc>
+        <w:tc>
+          <w:tcPr>
+            <w:tcW w:type="dxa" w:w="879"/>
+            <w:vAlign w:val="center"/>
+            <w:tcMar>
+              <w:top w:w="90" w:type="dxa"/>
+              <w:bottom w:w="90" w:type="dxa"/>
+              <w:left w:w="120" w:type="dxa"/>
+              <w:right w:w="120" w:type="dxa"/>
+            </w:tcMar>
+          </w:tcPr>
+          <w:p>
+            <w:pPr>
+              <w:spacing w:before="0" w:after="0" w:line="259" w:lineRule="auto"/>
+              <w:jc w:val="center"/>
+            </w:pPr>
+            <w:r/>
+            <w:r>
+              <w:rPr>
+                <w:rFonts w:ascii="Arial" w:hAnsi="Arial"/>
                 <w:b/>
-                <w:color w:val="16884A"/>
-                <w:sz w:val="17"/>
+                <w:sz w:val="16"/>
+              </w:rPr>
+              <w:t>X</w:t>
+            </w:r>
+          </w:p>
+        </w:tc>
+        <w:tc>
+          <w:tcPr>
+            <w:tcW w:type="dxa" w:w="992"/>
+          </w:tcPr>
+          <w:p/>
+        </w:tc>
+        <w:tc>
+          <w:tcPr>
+            <w:tcW w:type="dxa" w:w="1106"/>
+          </w:tcPr>
+          <w:p/>
+        </w:tc>
+        <w:tc>
+          <w:tcPr>
+            <w:tcW w:type="dxa" w:w="879"/>
+          </w:tcPr>
+          <w:p/>
+        </w:tc>
+        <w:tc>
+          <w:tcPr>
+            <w:tcW w:type="dxa" w:w="1191"/>
+            <w:vMerge w:val="restart"/>
+            <w:vAlign w:val="center"/>
+            <w:tcMar>
+              <w:top w:w="90" w:type="dxa"/>
+              <w:bottom w:w="90" w:type="dxa"/>
+              <w:left w:w="120" w:type="dxa"/>
+              <w:right w:w="120" w:type="dxa"/>
+            </w:tcMar>
+          </w:tcPr>
+          <w:p>
+            <w:pPr>
+              <w:spacing w:before="0" w:after="0" w:line="259" w:lineRule="auto"/>
+              <w:jc w:val="center"/>
+            </w:pPr>
+            <w:r/>
+            <w:r>
+              <w:rPr>
+                <w:rFonts w:ascii="Arial" w:hAnsi="Arial"/>
+                <w:b/>
+                <w:sz w:val="16"/>
+              </w:rPr>
+              <w:t>20</w:t>
+            </w:r>
+          </w:p>
+        </w:tc>
+      </w:tr>
+      <w:tr>
+        <w:tc>
+          <w:tcPr>
+            <w:tcW w:type="dxa" w:w="567"/>
+            <w:vMerge/>
+          </w:tcPr>
+          <w:p/>
+        </w:tc>
+        <w:tc>
+          <w:tcPr>
+            <w:tcW w:type="dxa" w:w="1984"/>
+            <w:vMerge/>
+          </w:tcPr>
+          <w:p/>
+        </w:tc>
+        <w:tc>
+          <w:tcPr>
+            <w:tcW w:type="dxa" w:w="2608"/>
+            <w:vAlign w:val="center"/>
+            <w:tcMar>
+              <w:top w:w="90" w:type="dxa"/>
+              <w:bottom w:w="90" w:type="dxa"/>
+              <w:left w:w="120" w:type="dxa"/>
+              <w:right w:w="120" w:type="dxa"/>
+            </w:tcMar>
+          </w:tcPr>
+          <w:p>
+            <w:pPr>
+              <w:spacing w:before="0" w:after="0" w:line="259" w:lineRule="auto"/>
+              <w:jc w:val="left"/>
+            </w:pPr>
+            <w:r/>
+            <w:r>
+              <w:rPr>
+                <w:rFonts w:ascii="Arial" w:hAnsi="Arial"/>
+                <w:b w:val="0"/>
+                <w:sz w:val="16"/>
+              </w:rPr>
+              <w:t>Carga de su fotografía y corrección del formato y de una entrada duplicada del perfil.</w:t>
+            </w:r>
+          </w:p>
+        </w:tc>
+        <w:tc>
+          <w:tcPr>
+            <w:tcW w:type="dxa" w:w="879"/>
+            <w:vAlign w:val="center"/>
+            <w:tcMar>
+              <w:top w:w="90" w:type="dxa"/>
+              <w:bottom w:w="90" w:type="dxa"/>
+              <w:left w:w="120" w:type="dxa"/>
+              <w:right w:w="120" w:type="dxa"/>
+            </w:tcMar>
+          </w:tcPr>
+          <w:p>
+            <w:pPr>
+              <w:spacing w:before="0" w:after="0" w:line="259" w:lineRule="auto"/>
+              <w:jc w:val="center"/>
+            </w:pPr>
+            <w:r/>
+            <w:r>
+              <w:rPr>
+                <w:rFonts w:ascii="Arial" w:hAnsi="Arial"/>
+                <w:b/>
+                <w:sz w:val="16"/>
+              </w:rPr>
+              <w:t>X</w:t>
+            </w:r>
+          </w:p>
+        </w:tc>
+        <w:tc>
+          <w:tcPr>
+            <w:tcW w:type="dxa" w:w="992"/>
+          </w:tcPr>
+          <w:p/>
+        </w:tc>
+        <w:tc>
+          <w:tcPr>
+            <w:tcW w:type="dxa" w:w="1106"/>
+          </w:tcPr>
+          <w:p/>
+        </w:tc>
+        <w:tc>
+          <w:tcPr>
+            <w:tcW w:type="dxa" w:w="879"/>
+          </w:tcPr>
+          <w:p/>
+        </w:tc>
+        <w:tc>
+          <w:tcPr>
+            <w:tcW w:type="dxa" w:w="1191"/>
+            <w:vMerge/>
+          </w:tcPr>
+          <w:p/>
+        </w:tc>
+      </w:tr>
+      <w:tr>
+        <w:tc>
+          <w:tcPr>
+            <w:tcW w:type="dxa" w:w="567"/>
+            <w:vAlign w:val="center"/>
+            <w:tcMar>
+              <w:top w:w="90" w:type="dxa"/>
+              <w:bottom w:w="90" w:type="dxa"/>
+              <w:left w:w="120" w:type="dxa"/>
+              <w:right w:w="120" w:type="dxa"/>
+            </w:tcMar>
+          </w:tcPr>
+          <w:p>
+            <w:pPr>
+              <w:spacing w:before="0" w:after="0" w:line="259" w:lineRule="auto"/>
+              <w:jc w:val="center"/>
+            </w:pPr>
+            <w:r/>
+            <w:r>
+              <w:rPr>
+                <w:rFonts w:ascii="Arial" w:hAnsi="Arial"/>
+                <w:b w:val="0"/>
+                <w:sz w:val="16"/>
+              </w:rPr>
+              <w:t>3</w:t>
+            </w:r>
+          </w:p>
+        </w:tc>
+        <w:tc>
+          <w:tcPr>
+            <w:tcW w:type="dxa" w:w="1984"/>
+            <w:vAlign w:val="center"/>
+            <w:tcMar>
+              <w:top w:w="90" w:type="dxa"/>
+              <w:bottom w:w="90" w:type="dxa"/>
+              <w:left w:w="120" w:type="dxa"/>
+              <w:right w:w="120" w:type="dxa"/>
+            </w:tcMar>
+          </w:tcPr>
+          <w:p>
+            <w:pPr>
+              <w:spacing w:before="0" w:after="0" w:line="259" w:lineRule="auto"/>
+              <w:jc w:val="center"/>
+            </w:pPr>
+            <w:r/>
+            <w:r>
+              <w:rPr>
+                <w:rFonts w:ascii="Arial" w:hAnsi="Arial"/>
+                <w:b w:val="0"/>
+                <w:sz w:val="14"/>
+              </w:rPr>
+              <w:t>Fabricio Jose Rivera Rupay</w:t>
+              <w:br/>
+              <w:t>U202423883</w:t>
+              <w:br/>
+              <w:t>u202423883@upc.edu.pe</w:t>
+            </w:r>
+          </w:p>
+        </w:tc>
+        <w:tc>
+          <w:tcPr>
+            <w:tcW w:type="dxa" w:w="2608"/>
+            <w:vAlign w:val="center"/>
+            <w:tcMar>
+              <w:top w:w="90" w:type="dxa"/>
+              <w:bottom w:w="90" w:type="dxa"/>
+              <w:left w:w="120" w:type="dxa"/>
+              <w:right w:w="120" w:type="dxa"/>
+            </w:tcMar>
+          </w:tcPr>
+          <w:p>
+            <w:pPr>
+              <w:spacing w:before="0" w:after="0" w:line="259" w:lineRule="auto"/>
+              <w:jc w:val="left"/>
+            </w:pPr>
+            <w:r/>
+            <w:r>
+              <w:rPr>
+                <w:rFonts w:ascii="Arial" w:hAnsi="Arial"/>
+                <w:b w:val="0"/>
+                <w:sz w:val="16"/>
+              </w:rPr>
+              <w:t>Apoyo al equipo en la preparación de la entrega AV1 de EnergyCore.</w:t>
+            </w:r>
+          </w:p>
+        </w:tc>
+        <w:tc>
+          <w:tcPr>
+            <w:tcW w:type="dxa" w:w="879"/>
+            <w:vAlign w:val="center"/>
+            <w:tcMar>
+              <w:top w:w="90" w:type="dxa"/>
+              <w:bottom w:w="90" w:type="dxa"/>
+              <w:left w:w="120" w:type="dxa"/>
+              <w:right w:w="120" w:type="dxa"/>
+            </w:tcMar>
+          </w:tcPr>
+          <w:p>
+            <w:pPr>
+              <w:spacing w:before="0" w:after="0" w:line="259" w:lineRule="auto"/>
+              <w:jc w:val="center"/>
+            </w:pPr>
+            <w:r/>
+            <w:r>
+              <w:rPr>
+                <w:rFonts w:ascii="Arial" w:hAnsi="Arial"/>
+                <w:b/>
+                <w:sz w:val="16"/>
+              </w:rPr>
+              <w:t>X</w:t>
+            </w:r>
+          </w:p>
+        </w:tc>
+        <w:tc>
+          <w:tcPr>
+            <w:tcW w:type="dxa" w:w="992"/>
+          </w:tcPr>
+          <w:p/>
+        </w:tc>
+        <w:tc>
+          <w:tcPr>
+            <w:tcW w:type="dxa" w:w="1106"/>
+          </w:tcPr>
+          <w:p/>
+        </w:tc>
+        <w:tc>
+          <w:tcPr>
+            <w:tcW w:type="dxa" w:w="879"/>
+          </w:tcPr>
+          <w:p/>
+        </w:tc>
+        <w:tc>
+          <w:tcPr>
+            <w:tcW w:type="dxa" w:w="1191"/>
+            <w:vAlign w:val="center"/>
+            <w:tcMar>
+              <w:top w:w="90" w:type="dxa"/>
+              <w:bottom w:w="90" w:type="dxa"/>
+              <w:left w:w="120" w:type="dxa"/>
+              <w:right w:w="120" w:type="dxa"/>
+            </w:tcMar>
+          </w:tcPr>
+          <w:p>
+            <w:pPr>
+              <w:spacing w:before="0" w:after="0" w:line="259" w:lineRule="auto"/>
+              <w:jc w:val="center"/>
+            </w:pPr>
+            <w:r/>
+            <w:r>
+              <w:rPr>
+                <w:rFonts w:ascii="Arial" w:hAnsi="Arial"/>
+                <w:b/>
+                <w:sz w:val="16"/>
+              </w:rPr>
+              <w:t>20</w:t>
+            </w:r>
+          </w:p>
+        </w:tc>
+      </w:tr>
+      <w:tr>
+        <w:tc>
+          <w:tcPr>
+            <w:tcW w:type="dxa" w:w="567"/>
+            <w:vAlign w:val="center"/>
+            <w:tcMar>
+              <w:top w:w="90" w:type="dxa"/>
+              <w:bottom w:w="90" w:type="dxa"/>
+              <w:left w:w="120" w:type="dxa"/>
+              <w:right w:w="120" w:type="dxa"/>
+            </w:tcMar>
+          </w:tcPr>
+          <w:p>
+            <w:pPr>
+              <w:spacing w:before="0" w:after="0" w:line="259" w:lineRule="auto"/>
+              <w:jc w:val="center"/>
+            </w:pPr>
+            <w:r/>
+            <w:r>
+              <w:rPr>
+                <w:rFonts w:ascii="Arial" w:hAnsi="Arial"/>
+                <w:b w:val="0"/>
+                <w:sz w:val="16"/>
+              </w:rPr>
+              <w:t>4</w:t>
+            </w:r>
+          </w:p>
+        </w:tc>
+        <w:tc>
+          <w:tcPr>
+            <w:tcW w:type="dxa" w:w="1984"/>
+            <w:vAlign w:val="center"/>
+            <w:tcMar>
+              <w:top w:w="90" w:type="dxa"/>
+              <w:bottom w:w="90" w:type="dxa"/>
+              <w:left w:w="120" w:type="dxa"/>
+              <w:right w:w="120" w:type="dxa"/>
+            </w:tcMar>
+          </w:tcPr>
+          <w:p>
+            <w:pPr>
+              <w:spacing w:before="0" w:after="0" w:line="259" w:lineRule="auto"/>
+              <w:jc w:val="center"/>
+            </w:pPr>
+            <w:r/>
+            <w:r>
+              <w:rPr>
+                <w:rFonts w:ascii="Arial" w:hAnsi="Arial"/>
+                <w:b w:val="0"/>
+                <w:sz w:val="14"/>
+              </w:rPr>
+              <w:t>Renzo Zamir Revilla Quispe</w:t>
+              <w:br/>
+              <w:t>U201717085</w:t>
+              <w:br/>
+              <w:t>u201717085@upc.edu.pe</w:t>
+            </w:r>
+          </w:p>
+        </w:tc>
+        <w:tc>
+          <w:tcPr>
+            <w:tcW w:type="dxa" w:w="2608"/>
+            <w:vAlign w:val="center"/>
+            <w:tcMar>
+              <w:top w:w="90" w:type="dxa"/>
+              <w:bottom w:w="90" w:type="dxa"/>
+              <w:left w:w="120" w:type="dxa"/>
+              <w:right w:w="120" w:type="dxa"/>
+            </w:tcMar>
+          </w:tcPr>
+          <w:p>
+            <w:pPr>
+              <w:spacing w:before="0" w:after="0" w:line="259" w:lineRule="auto"/>
+              <w:jc w:val="left"/>
+            </w:pPr>
+            <w:r/>
+            <w:r>
+              <w:rPr>
+                <w:rFonts w:ascii="Arial" w:hAnsi="Arial"/>
+                <w:b w:val="0"/>
+                <w:sz w:val="16"/>
+              </w:rPr>
+              <w:t>Apoyo al equipo en la preparación de la entrega AV1 de EnergyCore.</w:t>
+            </w:r>
+          </w:p>
+        </w:tc>
+        <w:tc>
+          <w:tcPr>
+            <w:tcW w:type="dxa" w:w="879"/>
+            <w:vAlign w:val="center"/>
+            <w:tcMar>
+              <w:top w:w="90" w:type="dxa"/>
+              <w:bottom w:w="90" w:type="dxa"/>
+              <w:left w:w="120" w:type="dxa"/>
+              <w:right w:w="120" w:type="dxa"/>
+            </w:tcMar>
+          </w:tcPr>
+          <w:p>
+            <w:pPr>
+              <w:spacing w:before="0" w:after="0" w:line="259" w:lineRule="auto"/>
+              <w:jc w:val="center"/>
+            </w:pPr>
+            <w:r/>
+            <w:r>
+              <w:rPr>
+                <w:rFonts w:ascii="Arial" w:hAnsi="Arial"/>
+                <w:b/>
+                <w:sz w:val="16"/>
+              </w:rPr>
+              <w:t>X</w:t>
+            </w:r>
+          </w:p>
+        </w:tc>
+        <w:tc>
+          <w:tcPr>
+            <w:tcW w:type="dxa" w:w="992"/>
+          </w:tcPr>
+          <w:p/>
+        </w:tc>
+        <w:tc>
+          <w:tcPr>
+            <w:tcW w:type="dxa" w:w="1106"/>
+          </w:tcPr>
+          <w:p/>
+        </w:tc>
+        <w:tc>
+          <w:tcPr>
+            <w:tcW w:type="dxa" w:w="879"/>
+          </w:tcPr>
+          <w:p/>
+        </w:tc>
+        <w:tc>
+          <w:tcPr>
+            <w:tcW w:type="dxa" w:w="1191"/>
+            <w:vAlign w:val="center"/>
+            <w:tcMar>
+              <w:top w:w="90" w:type="dxa"/>
+              <w:bottom w:w="90" w:type="dxa"/>
+              <w:left w:w="120" w:type="dxa"/>
+              <w:right w:w="120" w:type="dxa"/>
+            </w:tcMar>
+          </w:tcPr>
+          <w:p>
+            <w:pPr>
+              <w:spacing w:before="0" w:after="0" w:line="259" w:lineRule="auto"/>
+              <w:jc w:val="center"/>
+            </w:pPr>
+            <w:r/>
+            <w:r>
+              <w:rPr>
+                <w:rFonts w:ascii="Arial" w:hAnsi="Arial"/>
+                <w:b/>
+                <w:sz w:val="16"/>
+              </w:rPr>
+              <w:t>20</w:t>
+            </w:r>
+          </w:p>
+        </w:tc>
+      </w:tr>
+      <w:tr>
+        <w:tc>
+          <w:tcPr>
+            <w:tcW w:type="dxa" w:w="567"/>
+            <w:vAlign w:val="center"/>
+            <w:tcMar>
+              <w:top w:w="90" w:type="dxa"/>
+              <w:bottom w:w="90" w:type="dxa"/>
+              <w:left w:w="120" w:type="dxa"/>
+              <w:right w:w="120" w:type="dxa"/>
+            </w:tcMar>
+          </w:tcPr>
+          <w:p>
+            <w:pPr>
+              <w:spacing w:before="0" w:after="0" w:line="259" w:lineRule="auto"/>
+              <w:jc w:val="center"/>
+            </w:pPr>
+            <w:r/>
+            <w:r>
+              <w:rPr>
+                <w:rFonts w:ascii="Arial" w:hAnsi="Arial"/>
+                <w:b w:val="0"/>
+                <w:sz w:val="16"/>
+              </w:rPr>
+              <w:t>5</w:t>
+            </w:r>
+          </w:p>
+        </w:tc>
+        <w:tc>
+          <w:tcPr>
+            <w:tcW w:type="dxa" w:w="1984"/>
+            <w:vAlign w:val="center"/>
+            <w:tcMar>
+              <w:top w:w="90" w:type="dxa"/>
+              <w:bottom w:w="90" w:type="dxa"/>
+              <w:left w:w="120" w:type="dxa"/>
+              <w:right w:w="120" w:type="dxa"/>
+            </w:tcMar>
+          </w:tcPr>
+          <w:p>
+            <w:pPr>
+              <w:spacing w:before="0" w:after="0" w:line="259" w:lineRule="auto"/>
+              <w:jc w:val="center"/>
+            </w:pPr>
+            <w:r/>
+            <w:r>
+              <w:rPr>
+                <w:rFonts w:ascii="Arial" w:hAnsi="Arial"/>
+                <w:b w:val="0"/>
+                <w:sz w:val="14"/>
+              </w:rPr>
+              <w:t>Brayan Benjamin Huerta Cardenas</w:t>
+              <w:br/>
+              <w:t>U20241E550</w:t>
+              <w:br/>
+              <w:t>u20241e550@upc.edu.pe</w:t>
+            </w:r>
+          </w:p>
+        </w:tc>
+        <w:tc>
+          <w:tcPr>
+            <w:tcW w:type="dxa" w:w="2608"/>
+            <w:vAlign w:val="center"/>
+            <w:tcMar>
+              <w:top w:w="90" w:type="dxa"/>
+              <w:bottom w:w="90" w:type="dxa"/>
+              <w:left w:w="120" w:type="dxa"/>
+              <w:right w:w="120" w:type="dxa"/>
+            </w:tcMar>
+          </w:tcPr>
+          <w:p>
+            <w:pPr>
+              <w:spacing w:before="0" w:after="0" w:line="259" w:lineRule="auto"/>
+              <w:jc w:val="left"/>
+            </w:pPr>
+            <w:r/>
+            <w:r>
+              <w:rPr>
+                <w:rFonts w:ascii="Arial" w:hAnsi="Arial"/>
+                <w:b w:val="0"/>
+                <w:sz w:val="16"/>
+              </w:rPr>
+              <w:t>Apoyo al equipo en la preparación de la entrega AV1 de EnergyCore.</w:t>
+            </w:r>
+          </w:p>
+        </w:tc>
+        <w:tc>
+          <w:tcPr>
+            <w:tcW w:type="dxa" w:w="879"/>
+            <w:vAlign w:val="center"/>
+            <w:tcMar>
+              <w:top w:w="90" w:type="dxa"/>
+              <w:bottom w:w="90" w:type="dxa"/>
+              <w:left w:w="120" w:type="dxa"/>
+              <w:right w:w="120" w:type="dxa"/>
+            </w:tcMar>
+          </w:tcPr>
+          <w:p>
+            <w:pPr>
+              <w:spacing w:before="0" w:after="0" w:line="259" w:lineRule="auto"/>
+              <w:jc w:val="center"/>
+            </w:pPr>
+            <w:r/>
+            <w:r>
+              <w:rPr>
+                <w:rFonts w:ascii="Arial" w:hAnsi="Arial"/>
+                <w:b/>
+                <w:sz w:val="16"/>
+              </w:rPr>
+              <w:t>X</w:t>
+            </w:r>
+          </w:p>
+        </w:tc>
+        <w:tc>
+          <w:tcPr>
+            <w:tcW w:type="dxa" w:w="992"/>
+          </w:tcPr>
+          <w:p/>
+        </w:tc>
+        <w:tc>
+          <w:tcPr>
+            <w:tcW w:type="dxa" w:w="1106"/>
+          </w:tcPr>
+          <w:p/>
+        </w:tc>
+        <w:tc>
+          <w:tcPr>
+            <w:tcW w:type="dxa" w:w="879"/>
+          </w:tcPr>
+          <w:p/>
+        </w:tc>
+        <w:tc>
+          <w:tcPr>
+            <w:tcW w:type="dxa" w:w="1191"/>
+            <w:vAlign w:val="center"/>
+            <w:tcMar>
+              <w:top w:w="90" w:type="dxa"/>
+              <w:bottom w:w="90" w:type="dxa"/>
+              <w:left w:w="120" w:type="dxa"/>
+              <w:right w:w="120" w:type="dxa"/>
+            </w:tcMar>
+          </w:tcPr>
+          <w:p>
+            <w:pPr>
+              <w:spacing w:before="0" w:after="0" w:line="259" w:lineRule="auto"/>
+              <w:jc w:val="center"/>
+            </w:pPr>
+            <w:r/>
+            <w:r>
+              <w:rPr>
+                <w:rFonts w:ascii="Arial" w:hAnsi="Arial"/>
+                <w:b/>
+                <w:sz w:val="16"/>
               </w:rPr>
               <w:t>20</w:t>
             </w:r>
@@ -791,197 +1588,14 @@
         </w:tc>
       </w:tr>
     </w:tbl>
-    <w:p/>
-    <w:p>
-      <w:r>
-        <w:rPr>
-          <w:b/>
-          <w:color w:val="5F6B63"/>
-          <w:sz w:val="18"/>
-        </w:rPr>
-        <w:t>Escala del Anexo B: 20 = cumplió a tiempo · 16 = cumplió tarde · 13 = cumplió parcialmente · 07/00 = no cumplió.</w:t>
-      </w:r>
-    </w:p>
-    <w:p>
-      <w:pPr>
-        <w:spacing w:before="200"/>
-      </w:pPr>
-      <w:r>
-        <w:rPr>
-          <w:b/>
-          <w:color w:val="16884A"/>
-          <w:sz w:val="28"/>
-        </w:rPr>
-        <w:t>Evidencia considerada</w:t>
-      </w:r>
-    </w:p>
-    <w:p>
-      <w:pPr>
-        <w:pStyle w:val="ListBullet"/>
-        <w:spacing w:after="60"/>
-      </w:pPr>
-      <w:r>
-        <w:t>Implementación presente en los cinco repositorios EnergyCore y ramas GitFlow preparadas para AV1.</w:t>
-      </w:r>
-    </w:p>
-    <w:p>
-      <w:pPr>
-        <w:pStyle w:val="ListBullet"/>
-        <w:spacing w:after="60"/>
-      </w:pPr>
-      <w:r>
-        <w:t>Validaciones registradas en el Project Report: backend, Angular y Flutter, con sus límites explícitos.</w:t>
-      </w:r>
-    </w:p>
-    <w:p>
-      <w:pPr>
-        <w:pStyle w:val="ListBullet"/>
-        <w:spacing w:after="60"/>
-      </w:pPr>
-      <w:r>
-        <w:t>Wireframes, mockups, flujo de usuario y capturas funcionales incorporados al repositorio del informe.</w:t>
-      </w:r>
-    </w:p>
-    <w:p>
-      <w:pPr>
-        <w:pStyle w:val="ListBullet"/>
-        <w:spacing w:after="60"/>
-      </w:pPr>
-      <w:r>
-        <w:t>Preparación reproducible de Cloud Run, Firebase Hosting y base de datos PostgreSQL administrada en Neon.</w:t>
-      </w:r>
-    </w:p>
-    <w:p>
-      <w:pPr>
-        <w:spacing w:before="200"/>
-      </w:pPr>
-      <w:r>
-        <w:rPr>
-          <w:i/>
-          <w:color w:val="5F6B63"/>
-          <w:sz w:val="18"/>
-        </w:rPr>
-        <w:t>Observación: esta valoración corresponde al aporte individual documentado para AV1. La nota definitiva está sujeta a la revisión del docente y a la evidencia publicada en GitHub.</w:t>
-      </w:r>
-    </w:p>
-    <w:tbl>
-      <w:tblPr>
-        <w:tblW w:type="auto" w:w="0"/>
-        <w:jc w:val="center"/>
-        <w:tblLayout w:type="fixed"/>
-        <w:tblLook w:firstColumn="1" w:firstRow="1" w:lastColumn="0" w:lastRow="0" w:noHBand="0" w:noVBand="1" w:val="04A0"/>
-      </w:tblPr>
-      <w:tblGrid>
-        <w:gridCol w:w="5326"/>
-        <w:gridCol w:w="5326"/>
-      </w:tblGrid>
-      <w:tr>
-        <w:tc>
-          <w:tcPr>
-            <w:tcW w:type="dxa" w:w="5326"/>
-          </w:tcPr>
-          <w:p/>
-        </w:tc>
-        <w:tc>
-          <w:tcPr>
-            <w:tcW w:type="dxa" w:w="5326"/>
-          </w:tcPr>
-          <w:p/>
-        </w:tc>
-      </w:tr>
-      <w:tr>
-        <w:tc>
-          <w:tcPr>
-            <w:tcW w:type="dxa" w:w="5326"/>
-            <w:vAlign w:val="center"/>
-          </w:tcPr>
-          <w:p>
-            <w:pPr>
-              <w:spacing w:after="0"/>
-              <w:jc w:val="center"/>
-            </w:pPr>
-            <w:r/>
-            <w:r>
-              <w:rPr>
-                <w:rFonts w:ascii="Aptos" w:hAnsi="Aptos"/>
-                <w:b/>
-                <w:color w:val="14231A"/>
-                <w:sz w:val="18"/>
-              </w:rPr>
-              <w:t>Jean Franck Loa Rojas</w:t>
-              <w:br/>
-              <w:t>Team Leader</w:t>
-            </w:r>
-          </w:p>
-        </w:tc>
-        <w:tc>
-          <w:tcPr>
-            <w:tcW w:type="dxa" w:w="5326"/>
-            <w:vAlign w:val="center"/>
-          </w:tcPr>
-          <w:p>
-            <w:pPr>
-              <w:spacing w:after="0"/>
-              <w:jc w:val="center"/>
-            </w:pPr>
-            <w:r/>
-            <w:r>
-              <w:rPr>
-                <w:rFonts w:ascii="Aptos" w:hAnsi="Aptos"/>
-                <w:b/>
-                <w:color w:val="14231A"/>
-                <w:sz w:val="18"/>
-              </w:rPr>
-              <w:t>Fecha de entrega AV1</w:t>
-            </w:r>
-          </w:p>
-        </w:tc>
-      </w:tr>
-    </w:tbl>
     <w:sectPr>
-      <w:pgSz w:w="12240" w:h="15840"/>
-      <w:pgMar w:top="1020" w:right="794" w:bottom="907" w:left="794" w:header="720" w:footer="720" w:gutter="0"/>
+      <w:pgSz w:w="11906" w:h="16838"/>
+      <w:pgMar w:top="1134" w:right="737" w:bottom="1134" w:left="737" w:header="720" w:footer="720" w:gutter="0"/>
       <w:cols w:space="720"/>
       <w:docGrid w:linePitch="360"/>
     </w:sectPr>
   </w:body>
 </w:document>
-</file>
-
-<file path=word/footer1.xml><?xml version="1.0" encoding="utf-8"?>
-<w:ftr xmlns:m="http://schemas.openxmlformats.org/officeDocument/2006/math" xmlns:mc="http://schemas.openxmlformats.org/markup-compatibility/2006" xmlns:mo="http://schemas.microsoft.com/office/mac/office/2008/main" xmlns:mv="urn:schemas-microsoft-com:mac:vml" xmlns:o="urn:schemas-microsoft-com:office:office" xmlns:r="http://schemas.openxmlformats.org/officeDocument/2006/relationships" xmlns:v="urn:schemas-microsoft-com:vml" xmlns:w10="urn:schemas-microsoft-com:office:word" xmlns:w14="http://schemas.microsoft.com/office/word/2010/wordml" xmlns:w="http://schemas.openxmlformats.org/wordprocessingml/2006/main" xmlns:wne="http://schemas.microsoft.com/office/word/2006/wordml" xmlns:wp14="http://schemas.microsoft.com/office/word/2010/wordprocessingDrawing" xmlns:wp="http://schemas.openxmlformats.org/drawingml/2006/wordprocessingDrawing" xmlns:wpc="http://schemas.microsoft.com/office/word/2010/wordprocessingCanvas" xmlns:wpg="http://schemas.microsoft.com/office/word/2010/wordprocessingGroup" xmlns:wpi="http://schemas.microsoft.com/office/word/2010/wordprocessingInk" xmlns:wps="http://schemas.microsoft.com/office/word/2010/wordprocessingShape" mc:Ignorable="w14 wp14">
-  <w:p>
-    <w:pPr>
-      <w:pStyle w:val="Footer"/>
-      <w:jc w:val="right"/>
-    </w:pPr>
-    <w:r>
-      <w:t xml:space="preserve">Página </w:t>
-      <w:fldChar w:fldCharType="begin"/>
-      <w:instrText xml:space="preserve">PAGE</w:instrText>
-      <w:fldChar w:fldCharType="end"/>
-    </w:r>
-  </w:p>
-</w:ftr>
-</file>
-
-<file path=word/header1.xml><?xml version="1.0" encoding="utf-8"?>
-<w:hdr xmlns:m="http://schemas.openxmlformats.org/officeDocument/2006/math" xmlns:mc="http://schemas.openxmlformats.org/markup-compatibility/2006" xmlns:mo="http://schemas.microsoft.com/office/mac/office/2008/main" xmlns:mv="urn:schemas-microsoft-com:mac:vml" xmlns:o="urn:schemas-microsoft-com:office:office" xmlns:r="http://schemas.openxmlformats.org/officeDocument/2006/relationships" xmlns:v="urn:schemas-microsoft-com:vml" xmlns:w10="urn:schemas-microsoft-com:office:word" xmlns:w14="http://schemas.microsoft.com/office/word/2010/wordml" xmlns:w="http://schemas.openxmlformats.org/wordprocessingml/2006/main" xmlns:wne="http://schemas.microsoft.com/office/word/2006/wordml" xmlns:wp14="http://schemas.microsoft.com/office/word/2010/wordprocessingDrawing" xmlns:wp="http://schemas.openxmlformats.org/drawingml/2006/wordprocessingDrawing" xmlns:wpc="http://schemas.microsoft.com/office/word/2010/wordprocessingCanvas" xmlns:wpg="http://schemas.microsoft.com/office/word/2010/wordprocessingGroup" xmlns:wpi="http://schemas.microsoft.com/office/word/2010/wordprocessingInk" xmlns:wps="http://schemas.microsoft.com/office/word/2010/wordprocessingShape" mc:Ignorable="w14 wp14">
-  <w:p>
-    <w:pPr>
-      <w:pStyle w:val="Header"/>
-      <w:jc w:val="right"/>
-    </w:pPr>
-    <w:r>
-      <w:rPr>
-        <w:b/>
-        <w:color w:val="16884A"/>
-        <w:sz w:val="16"/>
-      </w:rPr>
-      <w:t>TERALUME  /  ENERGYCORE  /  AV1</w:t>
-    </w:r>
-  </w:p>
-</w:hdr>
 </file>
 
 <file path=word/numbering.xml><?xml version="1.0" encoding="utf-8"?>
@@ -1347,10 +1961,12 @@
     <w:name w:val="Normal"/>
     <w:qFormat/>
     <w:rsid w:val="00FC693F"/>
+    <w:pPr>
+      <w:spacing w:after="0"/>
+    </w:pPr>
     <w:rPr>
-      <w:rFonts w:ascii="Aptos" w:hAnsi="Aptos"/>
-      <w:color w:val="14231A"/>
-      <w:sz w:val="21"/>
+      <w:rFonts w:ascii="Arial" w:hAnsi="Arial"/>
+      <w:sz w:val="18"/>
     </w:rPr>
   </w:style>
   <w:style w:type="paragraph" w:styleId="Header">
@@ -1701,12 +2317,11 @@
       <w:contextualSpacing/>
     </w:pPr>
     <w:rPr>
-      <w:rFonts w:asciiTheme="majorHAnsi" w:eastAsiaTheme="majorEastAsia" w:hAnsiTheme="majorHAnsi" w:cstheme="majorBidi" w:ascii="Aptos Display" w:hAnsi="Aptos Display"/>
-      <w:b/>
-      <w:color w:val="14231A"/>
+      <w:rFonts w:asciiTheme="majorHAnsi" w:eastAsiaTheme="majorEastAsia" w:hAnsiTheme="majorHAnsi" w:cstheme="majorBidi"/>
+      <w:color w:val="17365D" w:themeColor="text2" w:themeShade="BF"/>
       <w:spacing w:val="5"/>
       <w:kern w:val="28"/>
-      <w:sz w:val="54"/>
+      <w:sz w:val="52"/>
       <w:szCs w:val="52"/>
     </w:rPr>
   </w:style>

</xml_diff>